<commit_message>
Atulização e ajustes da documentação
</commit_message>
<xml_diff>
--- a/fase-02/reports/Relatorio Tecnico V1.docx
+++ b/fase-02/reports/Relatorio Tecnico V1.docx
@@ -193,6 +193,12 @@
     </w:p>
     <w:sdt>
       <w:sdtPr>
+        <w:rPr>
+          <w:rFonts w:ascii="Arial" w:eastAsia="Arial" w:hAnsi="Arial" w:cs="Arial"/>
+          <w:color w:val="auto"/>
+          <w:sz w:val="22"/>
+          <w:szCs w:val="22"/>
+        </w:rPr>
         <w:id w:val="59292712"/>
         <w:docPartObj>
           <w:docPartGallery w:val="Table of Contents"/>
@@ -201,12 +207,8 @@
       </w:sdtPr>
       <w:sdtEndPr>
         <w:rPr>
-          <w:rFonts w:ascii="Arial" w:eastAsia="Arial" w:hAnsi="Arial" w:cs="Arial"/>
           <w:b/>
           <w:bCs/>
-          <w:color w:val="auto"/>
-          <w:sz w:val="22"/>
-          <w:szCs w:val="22"/>
         </w:rPr>
       </w:sdtEndPr>
       <w:sdtContent>
@@ -2279,28 +2281,7 @@
         <w:spacing w:after="160"/>
       </w:pPr>
       <w:r>
-        <w:t>Dos projetos expostos, resolvi optar pelo</w:t>
-      </w:r>
-      <w:r>
-        <w:t xml:space="preserve"> Projeto </w:t>
-      </w:r>
-      <w:r>
-        <w:t>1,</w:t>
-      </w:r>
-      <w:r>
-        <w:t xml:space="preserve"> Otimização de Modelos de Diagnóstico, </w:t>
-      </w:r>
-      <w:r>
-        <w:t>pois no meu entendimento eu poderia dar uma</w:t>
-      </w:r>
-      <w:r>
-        <w:t xml:space="preserve"> continuidade direta com a Fase 1</w:t>
-      </w:r>
-      <w:r>
-        <w:t>, dados que</w:t>
-      </w:r>
-      <w:r>
-        <w:t xml:space="preserve"> os modelos já construídos e validados servem como ponto de partida para o AG, eliminando retrabalho e permitindo comparação direta de desempenho antes e depois da otimização.</w:t>
+        <w:t>Dos projetos expostos, resolvi optar pelo Projeto 1, Otimização de Modelos de Diagnóstico, pois no meu entendimento eu poderia dar uma continuidade direta com a Fase 1, dados que os modelos já construídos e validados servem como ponto de partida para o AG, eliminando retrabalho e permitindo comparação direta de desempenho antes e depois da otimização.</w:t>
       </w:r>
     </w:p>
     <w:p>
@@ -2575,12 +2556,6 @@
         <w:gridCol w:w="4256"/>
       </w:tblGrid>
       <w:tr>
-        <w:tblPrEx>
-          <w:tblCellMar>
-            <w:top w:w="0" w:type="dxa"/>
-            <w:bottom w:w="0" w:type="dxa"/>
-          </w:tblCellMar>
-        </w:tblPrEx>
         <w:tc>
           <w:tcPr>
             <w:tcW w:w="2551" w:type="dxa"/>
@@ -2691,12 +2666,6 @@
         </w:tc>
       </w:tr>
       <w:tr>
-        <w:tblPrEx>
-          <w:tblCellMar>
-            <w:top w:w="0" w:type="dxa"/>
-            <w:bottom w:w="0" w:type="dxa"/>
-          </w:tblCellMar>
-        </w:tblPrEx>
         <w:tc>
           <w:tcPr>
             <w:tcW w:w="2551" w:type="dxa"/>
@@ -2836,12 +2805,6 @@
         </w:tc>
       </w:tr>
       <w:tr>
-        <w:tblPrEx>
-          <w:tblCellMar>
-            <w:top w:w="0" w:type="dxa"/>
-            <w:bottom w:w="0" w:type="dxa"/>
-          </w:tblCellMar>
-        </w:tblPrEx>
         <w:tc>
           <w:tcPr>
             <w:tcW w:w="2551" w:type="dxa"/>
@@ -2968,12 +2931,6 @@
         </w:tc>
       </w:tr>
       <w:tr>
-        <w:tblPrEx>
-          <w:tblCellMar>
-            <w:top w:w="0" w:type="dxa"/>
-            <w:bottom w:w="0" w:type="dxa"/>
-          </w:tblCellMar>
-        </w:tblPrEx>
         <w:tc>
           <w:tcPr>
             <w:tcW w:w="2551" w:type="dxa"/>
@@ -3093,12 +3050,6 @@
         </w:tc>
       </w:tr>
       <w:tr>
-        <w:tblPrEx>
-          <w:tblCellMar>
-            <w:top w:w="0" w:type="dxa"/>
-            <w:bottom w:w="0" w:type="dxa"/>
-          </w:tblCellMar>
-        </w:tblPrEx>
         <w:tc>
           <w:tcPr>
             <w:tcW w:w="2551" w:type="dxa"/>
@@ -3241,12 +3192,6 @@
         </w:tc>
       </w:tr>
       <w:tr>
-        <w:tblPrEx>
-          <w:tblCellMar>
-            <w:top w:w="0" w:type="dxa"/>
-            <w:bottom w:w="0" w:type="dxa"/>
-          </w:tblCellMar>
-        </w:tblPrEx>
         <w:tc>
           <w:tcPr>
             <w:tcW w:w="2551" w:type="dxa"/>
@@ -3484,12 +3429,6 @@
         <w:gridCol w:w="3859"/>
       </w:tblGrid>
       <w:tr>
-        <w:tblPrEx>
-          <w:tblCellMar>
-            <w:top w:w="0" w:type="dxa"/>
-            <w:bottom w:w="0" w:type="dxa"/>
-          </w:tblCellMar>
-        </w:tblPrEx>
         <w:tc>
           <w:tcPr>
             <w:tcW w:w="2500" w:type="dxa"/>
@@ -3578,12 +3517,6 @@
         </w:tc>
       </w:tr>
       <w:tr>
-        <w:tblPrEx>
-          <w:tblCellMar>
-            <w:top w:w="0" w:type="dxa"/>
-            <w:bottom w:w="0" w:type="dxa"/>
-          </w:tblCellMar>
-        </w:tblPrEx>
         <w:tc>
           <w:tcPr>
             <w:tcW w:w="2500" w:type="dxa"/>
@@ -3665,12 +3598,6 @@
         </w:tc>
       </w:tr>
       <w:tr>
-        <w:tblPrEx>
-          <w:tblCellMar>
-            <w:top w:w="0" w:type="dxa"/>
-            <w:bottom w:w="0" w:type="dxa"/>
-          </w:tblCellMar>
-        </w:tblPrEx>
         <w:tc>
           <w:tcPr>
             <w:tcW w:w="2500" w:type="dxa"/>
@@ -3748,12 +3675,6 @@
         </w:tc>
       </w:tr>
       <w:tr>
-        <w:tblPrEx>
-          <w:tblCellMar>
-            <w:top w:w="0" w:type="dxa"/>
-            <w:bottom w:w="0" w:type="dxa"/>
-          </w:tblCellMar>
-        </w:tblPrEx>
         <w:tc>
           <w:tcPr>
             <w:tcW w:w="2500" w:type="dxa"/>
@@ -3823,12 +3744,6 @@
         </w:tc>
       </w:tr>
       <w:tr>
-        <w:tblPrEx>
-          <w:tblCellMar>
-            <w:top w:w="0" w:type="dxa"/>
-            <w:bottom w:w="0" w:type="dxa"/>
-          </w:tblCellMar>
-        </w:tblPrEx>
         <w:tc>
           <w:tcPr>
             <w:tcW w:w="2500" w:type="dxa"/>
@@ -3902,12 +3817,6 @@
         </w:tc>
       </w:tr>
       <w:tr>
-        <w:tblPrEx>
-          <w:tblCellMar>
-            <w:top w:w="0" w:type="dxa"/>
-            <w:bottom w:w="0" w:type="dxa"/>
-          </w:tblCellMar>
-        </w:tblPrEx>
         <w:tc>
           <w:tcPr>
             <w:tcW w:w="2500" w:type="dxa"/>
@@ -3977,12 +3886,6 @@
         </w:tc>
       </w:tr>
       <w:tr>
-        <w:tblPrEx>
-          <w:tblCellMar>
-            <w:top w:w="0" w:type="dxa"/>
-            <w:bottom w:w="0" w:type="dxa"/>
-          </w:tblCellMar>
-        </w:tblPrEx>
         <w:tc>
           <w:tcPr>
             <w:tcW w:w="2500" w:type="dxa"/>
@@ -4052,12 +3955,6 @@
         </w:tc>
       </w:tr>
       <w:tr>
-        <w:tblPrEx>
-          <w:tblCellMar>
-            <w:top w:w="0" w:type="dxa"/>
-            <w:bottom w:w="0" w:type="dxa"/>
-          </w:tblCellMar>
-        </w:tblPrEx>
         <w:tc>
           <w:tcPr>
             <w:tcW w:w="2500" w:type="dxa"/>
@@ -4127,12 +4024,6 @@
         </w:tc>
       </w:tr>
       <w:tr>
-        <w:tblPrEx>
-          <w:tblCellMar>
-            <w:top w:w="0" w:type="dxa"/>
-            <w:bottom w:w="0" w:type="dxa"/>
-          </w:tblCellMar>
-        </w:tblPrEx>
         <w:tc>
           <w:tcPr>
             <w:tcW w:w="2500" w:type="dxa"/>
@@ -4206,12 +4097,6 @@
         </w:tc>
       </w:tr>
       <w:tr>
-        <w:tblPrEx>
-          <w:tblCellMar>
-            <w:top w:w="0" w:type="dxa"/>
-            <w:bottom w:w="0" w:type="dxa"/>
-          </w:tblCellMar>
-        </w:tblPrEx>
         <w:tc>
           <w:tcPr>
             <w:tcW w:w="2500" w:type="dxa"/>
@@ -4291,12 +4176,6 @@
         </w:tc>
       </w:tr>
       <w:tr>
-        <w:tblPrEx>
-          <w:tblCellMar>
-            <w:top w:w="0" w:type="dxa"/>
-            <w:bottom w:w="0" w:type="dxa"/>
-          </w:tblCellMar>
-        </w:tblPrEx>
         <w:tc>
           <w:tcPr>
             <w:tcW w:w="2500" w:type="dxa"/>
@@ -4376,12 +4255,6 @@
         </w:tc>
       </w:tr>
       <w:tr>
-        <w:tblPrEx>
-          <w:tblCellMar>
-            <w:top w:w="0" w:type="dxa"/>
-            <w:bottom w:w="0" w:type="dxa"/>
-          </w:tblCellMar>
-        </w:tblPrEx>
         <w:tc>
           <w:tcPr>
             <w:tcW w:w="2500" w:type="dxa"/>
@@ -4453,12 +4326,6 @@
         </w:tc>
       </w:tr>
       <w:tr>
-        <w:tblPrEx>
-          <w:tblCellMar>
-            <w:top w:w="0" w:type="dxa"/>
-            <w:bottom w:w="0" w:type="dxa"/>
-          </w:tblCellMar>
-        </w:tblPrEx>
         <w:tc>
           <w:tcPr>
             <w:tcW w:w="2500" w:type="dxa"/>
@@ -4544,12 +4411,6 @@
         </w:tc>
       </w:tr>
       <w:tr>
-        <w:tblPrEx>
-          <w:tblCellMar>
-            <w:top w:w="0" w:type="dxa"/>
-            <w:bottom w:w="0" w:type="dxa"/>
-          </w:tblCellMar>
-        </w:tblPrEx>
         <w:tc>
           <w:tcPr>
             <w:tcW w:w="2500" w:type="dxa"/>
@@ -4874,12 +4735,6 @@
         <w:gridCol w:w="1833"/>
       </w:tblGrid>
       <w:tr>
-        <w:tblPrEx>
-          <w:tblCellMar>
-            <w:top w:w="0" w:type="dxa"/>
-            <w:bottom w:w="0" w:type="dxa"/>
-          </w:tblCellMar>
-        </w:tblPrEx>
         <w:tc>
           <w:tcPr>
             <w:tcW w:w="3000" w:type="dxa"/>
@@ -5022,12 +4877,6 @@
         </w:tc>
       </w:tr>
       <w:tr>
-        <w:tblPrEx>
-          <w:tblCellMar>
-            <w:top w:w="0" w:type="dxa"/>
-            <w:bottom w:w="0" w:type="dxa"/>
-          </w:tblCellMar>
-        </w:tblPrEx>
         <w:tc>
           <w:tcPr>
             <w:tcW w:w="3000" w:type="dxa"/>
@@ -5145,12 +4994,6 @@
         </w:tc>
       </w:tr>
       <w:tr>
-        <w:tblPrEx>
-          <w:tblCellMar>
-            <w:top w:w="0" w:type="dxa"/>
-            <w:bottom w:w="0" w:type="dxa"/>
-          </w:tblCellMar>
-        </w:tblPrEx>
         <w:tc>
           <w:tcPr>
             <w:tcW w:w="3000" w:type="dxa"/>
@@ -5268,12 +5111,6 @@
         </w:tc>
       </w:tr>
       <w:tr>
-        <w:tblPrEx>
-          <w:tblCellMar>
-            <w:top w:w="0" w:type="dxa"/>
-            <w:bottom w:w="0" w:type="dxa"/>
-          </w:tblCellMar>
-        </w:tblPrEx>
         <w:tc>
           <w:tcPr>
             <w:tcW w:w="3000" w:type="dxa"/>
@@ -5447,12 +5284,6 @@
         <w:gridCol w:w="3779"/>
       </w:tblGrid>
       <w:tr>
-        <w:tblPrEx>
-          <w:tblCellMar>
-            <w:top w:w="0" w:type="dxa"/>
-            <w:bottom w:w="0" w:type="dxa"/>
-          </w:tblCellMar>
-        </w:tblPrEx>
         <w:tc>
           <w:tcPr>
             <w:tcW w:w="5580" w:type="dxa"/>
@@ -5511,12 +5342,6 @@
         </w:tc>
       </w:tr>
       <w:tr>
-        <w:tblPrEx>
-          <w:tblCellMar>
-            <w:top w:w="0" w:type="dxa"/>
-            <w:bottom w:w="0" w:type="dxa"/>
-          </w:tblCellMar>
-        </w:tblPrEx>
         <w:tc>
           <w:tcPr>
             <w:tcW w:w="5580" w:type="dxa"/>
@@ -5575,12 +5400,6 @@
         </w:tc>
       </w:tr>
       <w:tr>
-        <w:tblPrEx>
-          <w:tblCellMar>
-            <w:top w:w="0" w:type="dxa"/>
-            <w:bottom w:w="0" w:type="dxa"/>
-          </w:tblCellMar>
-        </w:tblPrEx>
         <w:tc>
           <w:tcPr>
             <w:tcW w:w="5580" w:type="dxa"/>
@@ -5629,12 +5448,6 @@
         </w:tc>
       </w:tr>
       <w:tr>
-        <w:tblPrEx>
-          <w:tblCellMar>
-            <w:top w:w="0" w:type="dxa"/>
-            <w:bottom w:w="0" w:type="dxa"/>
-          </w:tblCellMar>
-        </w:tblPrEx>
         <w:tc>
           <w:tcPr>
             <w:tcW w:w="5580" w:type="dxa"/>
@@ -5683,12 +5496,6 @@
         </w:tc>
       </w:tr>
       <w:tr>
-        <w:tblPrEx>
-          <w:tblCellMar>
-            <w:top w:w="0" w:type="dxa"/>
-            <w:bottom w:w="0" w:type="dxa"/>
-          </w:tblCellMar>
-        </w:tblPrEx>
         <w:tc>
           <w:tcPr>
             <w:tcW w:w="5580" w:type="dxa"/>
@@ -5771,12 +5578,6 @@
         <w:gridCol w:w="1860"/>
       </w:tblGrid>
       <w:tr>
-        <w:tblPrEx>
-          <w:tblCellMar>
-            <w:top w:w="0" w:type="dxa"/>
-            <w:bottom w:w="0" w:type="dxa"/>
-          </w:tblCellMar>
-        </w:tblPrEx>
         <w:tc>
           <w:tcPr>
             <w:tcW w:w="2800" w:type="dxa"/>
@@ -5929,12 +5730,6 @@
         </w:tc>
       </w:tr>
       <w:tr>
-        <w:tblPrEx>
-          <w:tblCellMar>
-            <w:top w:w="0" w:type="dxa"/>
-            <w:bottom w:w="0" w:type="dxa"/>
-          </w:tblCellMar>
-        </w:tblPrEx>
         <w:tc>
           <w:tcPr>
             <w:tcW w:w="2800" w:type="dxa"/>
@@ -6070,12 +5865,6 @@
         </w:tc>
       </w:tr>
       <w:tr>
-        <w:tblPrEx>
-          <w:tblCellMar>
-            <w:top w:w="0" w:type="dxa"/>
-            <w:bottom w:w="0" w:type="dxa"/>
-          </w:tblCellMar>
-        </w:tblPrEx>
         <w:tc>
           <w:tcPr>
             <w:tcW w:w="2800" w:type="dxa"/>
@@ -6201,12 +5990,6 @@
         </w:tc>
       </w:tr>
       <w:tr>
-        <w:tblPrEx>
-          <w:tblCellMar>
-            <w:top w:w="0" w:type="dxa"/>
-            <w:bottom w:w="0" w:type="dxa"/>
-          </w:tblCellMar>
-        </w:tblPrEx>
         <w:tc>
           <w:tcPr>
             <w:tcW w:w="2800" w:type="dxa"/>
@@ -6332,12 +6115,6 @@
         </w:tc>
       </w:tr>
       <w:tr>
-        <w:tblPrEx>
-          <w:tblCellMar>
-            <w:top w:w="0" w:type="dxa"/>
-            <w:bottom w:w="0" w:type="dxa"/>
-          </w:tblCellMar>
-        </w:tblPrEx>
         <w:tc>
           <w:tcPr>
             <w:tcW w:w="2800" w:type="dxa"/>
@@ -6502,12 +6279,6 @@
         <w:gridCol w:w="6359"/>
       </w:tblGrid>
       <w:tr>
-        <w:tblPrEx>
-          <w:tblCellMar>
-            <w:top w:w="0" w:type="dxa"/>
-            <w:bottom w:w="0" w:type="dxa"/>
-          </w:tblCellMar>
-        </w:tblPrEx>
         <w:tc>
           <w:tcPr>
             <w:tcW w:w="3000" w:type="dxa"/>
@@ -6576,12 +6347,6 @@
         </w:tc>
       </w:tr>
       <w:tr>
-        <w:tblPrEx>
-          <w:tblCellMar>
-            <w:top w:w="0" w:type="dxa"/>
-            <w:bottom w:w="0" w:type="dxa"/>
-          </w:tblCellMar>
-        </w:tblPrEx>
         <w:tc>
           <w:tcPr>
             <w:tcW w:w="3000" w:type="dxa"/>
@@ -6645,12 +6410,6 @@
         </w:tc>
       </w:tr>
       <w:tr>
-        <w:tblPrEx>
-          <w:tblCellMar>
-            <w:top w:w="0" w:type="dxa"/>
-            <w:bottom w:w="0" w:type="dxa"/>
-          </w:tblCellMar>
-        </w:tblPrEx>
         <w:tc>
           <w:tcPr>
             <w:tcW w:w="3000" w:type="dxa"/>
@@ -6720,12 +6479,6 @@
         </w:tc>
       </w:tr>
       <w:tr>
-        <w:tblPrEx>
-          <w:tblCellMar>
-            <w:top w:w="0" w:type="dxa"/>
-            <w:bottom w:w="0" w:type="dxa"/>
-          </w:tblCellMar>
-        </w:tblPrEx>
         <w:tc>
           <w:tcPr>
             <w:tcW w:w="3000" w:type="dxa"/>
@@ -6808,12 +6561,6 @@
         </w:tc>
       </w:tr>
       <w:tr>
-        <w:tblPrEx>
-          <w:tblCellMar>
-            <w:top w:w="0" w:type="dxa"/>
-            <w:bottom w:w="0" w:type="dxa"/>
-          </w:tblCellMar>
-        </w:tblPrEx>
         <w:tc>
           <w:tcPr>
             <w:tcW w:w="3000" w:type="dxa"/>
@@ -6884,10 +6631,7 @@
         <w:spacing w:after="160"/>
       </w:pPr>
       <w:r>
-        <w:t>To</w:t>
-      </w:r>
-      <w:r>
-        <w:t>dos os 4 modelos melhoraram em relação ao baseline. O Experimento 2 (Balanceado) venceu em 3 de 4 modelos, confirmando a recomendação da literatura: populações muito pequenas convergem prematuramente (</w:t>
+        <w:t>Todos os 4 modelos melhoraram em relação ao baseline. O Experimento 2 (Balanceado) venceu em 3 de 4 modelos, confirmando a recomendação da literatura: populações muito pequenas convergem prematuramente (</w:t>
       </w:r>
       <w:proofErr w:type="spellStart"/>
       <w:r>
@@ -6903,13 +6647,7 @@
       </w:r>
       <w:proofErr w:type="spellEnd"/>
       <w:r>
-        <w:t xml:space="preserve"> 3). O KNN foi exceção</w:t>
-      </w:r>
-      <w:r>
-        <w:t xml:space="preserve">, </w:t>
-      </w:r>
-      <w:r>
-        <w:t xml:space="preserve">seu espaço de </w:t>
+        <w:t xml:space="preserve"> 3). O KNN foi exceção, seu espaço de </w:t>
       </w:r>
       <w:proofErr w:type="spellStart"/>
       <w:r>
@@ -7164,12 +6902,6 @@
         <w:gridCol w:w="4059"/>
       </w:tblGrid>
       <w:tr>
-        <w:tblPrEx>
-          <w:tblCellMar>
-            <w:top w:w="0" w:type="dxa"/>
-            <w:bottom w:w="0" w:type="dxa"/>
-          </w:tblCellMar>
-        </w:tblPrEx>
         <w:tc>
           <w:tcPr>
             <w:tcW w:w="2800" w:type="dxa"/>
@@ -7256,12 +6988,6 @@
         </w:tc>
       </w:tr>
       <w:tr>
-        <w:tblPrEx>
-          <w:tblCellMar>
-            <w:top w:w="0" w:type="dxa"/>
-            <w:bottom w:w="0" w:type="dxa"/>
-          </w:tblCellMar>
-        </w:tblPrEx>
         <w:tc>
           <w:tcPr>
             <w:tcW w:w="2800" w:type="dxa"/>
@@ -7338,12 +7064,6 @@
         </w:tc>
       </w:tr>
       <w:tr>
-        <w:tblPrEx>
-          <w:tblCellMar>
-            <w:top w:w="0" w:type="dxa"/>
-            <w:bottom w:w="0" w:type="dxa"/>
-          </w:tblCellMar>
-        </w:tblPrEx>
         <w:tc>
           <w:tcPr>
             <w:tcW w:w="2800" w:type="dxa"/>
@@ -7415,12 +7135,6 @@
         </w:tc>
       </w:tr>
       <w:tr>
-        <w:tblPrEx>
-          <w:tblCellMar>
-            <w:top w:w="0" w:type="dxa"/>
-            <w:bottom w:w="0" w:type="dxa"/>
-          </w:tblCellMar>
-        </w:tblPrEx>
         <w:tc>
           <w:tcPr>
             <w:tcW w:w="2800" w:type="dxa"/>
@@ -7492,12 +7206,6 @@
         </w:tc>
       </w:tr>
       <w:tr>
-        <w:tblPrEx>
-          <w:tblCellMar>
-            <w:top w:w="0" w:type="dxa"/>
-            <w:bottom w:w="0" w:type="dxa"/>
-          </w:tblCellMar>
-        </w:tblPrEx>
         <w:tc>
           <w:tcPr>
             <w:tcW w:w="2800" w:type="dxa"/>
@@ -7599,16 +7307,7 @@
         <w:spacing w:after="160"/>
       </w:pPr>
       <w:r>
-        <w:t>Trabalhei na implementação de</w:t>
-      </w:r>
-      <w:r>
-        <w:t xml:space="preserve"> 5 técnicas </w:t>
-      </w:r>
-      <w:r>
-        <w:t xml:space="preserve">no </w:t>
-      </w:r>
-      <w:r>
-        <w:t xml:space="preserve">prompt </w:t>
+        <w:t xml:space="preserve">Trabalhei na implementação de 5 técnicas no prompt </w:t>
       </w:r>
       <w:proofErr w:type="spellStart"/>
       <w:r>
@@ -7892,12 +7591,6 @@
         <w:gridCol w:w="2260"/>
       </w:tblGrid>
       <w:tr>
-        <w:tblPrEx>
-          <w:tblCellMar>
-            <w:top w:w="0" w:type="dxa"/>
-            <w:bottom w:w="0" w:type="dxa"/>
-          </w:tblCellMar>
-        </w:tblPrEx>
         <w:tc>
           <w:tcPr>
             <w:tcW w:w="800" w:type="dxa"/>
@@ -8078,12 +7771,6 @@
         </w:tc>
       </w:tr>
       <w:tr>
-        <w:tblPrEx>
-          <w:tblCellMar>
-            <w:top w:w="0" w:type="dxa"/>
-            <w:bottom w:w="0" w:type="dxa"/>
-          </w:tblCellMar>
-        </w:tblPrEx>
         <w:tc>
           <w:tcPr>
             <w:tcW w:w="800" w:type="dxa"/>
@@ -8224,12 +7911,6 @@
         </w:tc>
       </w:tr>
       <w:tr>
-        <w:tblPrEx>
-          <w:tblCellMar>
-            <w:top w:w="0" w:type="dxa"/>
-            <w:bottom w:w="0" w:type="dxa"/>
-          </w:tblCellMar>
-        </w:tblPrEx>
         <w:tc>
           <w:tcPr>
             <w:tcW w:w="800" w:type="dxa"/>
@@ -8370,12 +8051,6 @@
         </w:tc>
       </w:tr>
       <w:tr>
-        <w:tblPrEx>
-          <w:tblCellMar>
-            <w:top w:w="0" w:type="dxa"/>
-            <w:bottom w:w="0" w:type="dxa"/>
-          </w:tblCellMar>
-        </w:tblPrEx>
         <w:tc>
           <w:tcPr>
             <w:tcW w:w="800" w:type="dxa"/>
@@ -8571,12 +8246,6 @@
         <w:gridCol w:w="1225"/>
       </w:tblGrid>
       <w:tr>
-        <w:tblPrEx>
-          <w:tblCellMar>
-            <w:top w:w="0" w:type="dxa"/>
-            <w:bottom w:w="0" w:type="dxa"/>
-          </w:tblCellMar>
-        </w:tblPrEx>
         <w:tc>
           <w:tcPr>
             <w:tcW w:w="2000" w:type="dxa"/>
@@ -8747,12 +8416,6 @@
         </w:tc>
       </w:tr>
       <w:tr>
-        <w:tblPrEx>
-          <w:tblCellMar>
-            <w:top w:w="0" w:type="dxa"/>
-            <w:bottom w:w="0" w:type="dxa"/>
-          </w:tblCellMar>
-        </w:tblPrEx>
         <w:tc>
           <w:tcPr>
             <w:tcW w:w="2000" w:type="dxa"/>
@@ -8899,12 +8562,6 @@
         </w:tc>
       </w:tr>
       <w:tr>
-        <w:tblPrEx>
-          <w:tblCellMar>
-            <w:top w:w="0" w:type="dxa"/>
-            <w:bottom w:w="0" w:type="dxa"/>
-          </w:tblCellMar>
-        </w:tblPrEx>
         <w:tc>
           <w:tcPr>
             <w:tcW w:w="2000" w:type="dxa"/>
@@ -9051,12 +8708,6 @@
         </w:tc>
       </w:tr>
       <w:tr>
-        <w:tblPrEx>
-          <w:tblCellMar>
-            <w:top w:w="0" w:type="dxa"/>
-            <w:bottom w:w="0" w:type="dxa"/>
-          </w:tblCellMar>
-        </w:tblPrEx>
         <w:tc>
           <w:tcPr>
             <w:tcW w:w="2000" w:type="dxa"/>
@@ -9509,10 +9160,7 @@
         <w:spacing w:after="160"/>
       </w:pPr>
       <w:r>
-        <w:t>Pude observar nesse projeto</w:t>
-      </w:r>
-      <w:r>
-        <w:t xml:space="preserve"> como Algoritmos Genéticos e </w:t>
+        <w:t xml:space="preserve">Pude observar nesse projeto como Algoritmos Genéticos e </w:t>
       </w:r>
       <w:proofErr w:type="spellStart"/>
       <w:r>
@@ -9520,13 +9168,7 @@
       </w:r>
       <w:proofErr w:type="spellEnd"/>
       <w:r>
-        <w:t xml:space="preserve"> podem complementar o pipeline de Machine Learning desenvolvido na Fase 1</w:t>
-      </w:r>
-      <w:r>
-        <w:t xml:space="preserve"> de duas formas</w:t>
-      </w:r>
-      <w:r>
-        <w:t xml:space="preserve"> distintos:</w:t>
+        <w:t xml:space="preserve"> podem complementar o pipeline de Machine Learning desenvolvido na Fase 1 de duas formas distintos:</w:t>
       </w:r>
     </w:p>
     <w:p>
@@ -9645,39 +9287,44 @@
           <w:rPr>
             <w:rStyle w:val="Hyperlink"/>
           </w:rPr>
-          <w:t>https://github.com/fernand</w:t>
+          <w:t>https://github.com/fernando-m-vale/IA-For-Devs/tree/main/fase-02</w:t>
+        </w:r>
+      </w:hyperlink>
+    </w:p>
+    <w:p>
+      <w:pPr>
+        <w:pStyle w:val="Ttulo2"/>
+      </w:pPr>
+      <w:bookmarkStart w:id="42" w:name="_Toc238564525"/>
+      <w:r>
+        <w:t>8.2 Vídeo de demonstração</w:t>
+      </w:r>
+      <w:bookmarkEnd w:id="42"/>
+    </w:p>
+    <w:p>
+      <w:pPr>
+        <w:spacing w:after="160"/>
+      </w:pPr>
+      <w:hyperlink r:id="rId10" w:history="1">
+        <w:r>
+          <w:rPr>
+            <w:rStyle w:val="Hyperlink"/>
+          </w:rPr>
+          <w:t>https://www.youtube.com/watch?</w:t>
         </w:r>
         <w:r>
           <w:rPr>
             <w:rStyle w:val="Hyperlink"/>
           </w:rPr>
-          <w:t>o</w:t>
+          <w:t>v</w:t>
         </w:r>
         <w:r>
           <w:rPr>
             <w:rStyle w:val="Hyperlink"/>
           </w:rPr>
-          <w:t>-m-vale/IA-For-Devs/tree/main/fase-02</w:t>
+          <w:t>=5fyzxE77Jc8</w:t>
         </w:r>
       </w:hyperlink>
-    </w:p>
-    <w:p>
-      <w:pPr>
-        <w:pStyle w:val="Ttulo2"/>
-      </w:pPr>
-      <w:bookmarkStart w:id="42" w:name="_Toc238564525"/>
-      <w:r>
-        <w:t>8.2 Vídeo de demonstração</w:t>
-      </w:r>
-      <w:bookmarkEnd w:id="42"/>
-    </w:p>
-    <w:p>
-      <w:pPr>
-        <w:spacing w:after="160"/>
-      </w:pPr>
-      <w:r>
-        <w:t>[link a ser adicionado após a gravação]</w:t>
-      </w:r>
     </w:p>
     <w:p>
       <w:pPr>
@@ -9798,10 +9445,10 @@
       </w:r>
     </w:p>
     <w:sectPr>
-      <w:headerReference w:type="default" r:id="rId10"/>
-      <w:footerReference w:type="default" r:id="rId11"/>
-      <w:headerReference w:type="first" r:id="rId12"/>
-      <w:footerReference w:type="first" r:id="rId13"/>
+      <w:headerReference w:type="default" r:id="rId11"/>
+      <w:footerReference w:type="default" r:id="rId12"/>
+      <w:headerReference w:type="first" r:id="rId13"/>
+      <w:footerReference w:type="first" r:id="rId14"/>
       <w:pgSz w:w="12240" w:h="15840"/>
       <w:pgMar w:top="1440" w:right="1440" w:bottom="1440" w:left="1440" w:header="708" w:footer="708" w:gutter="0"/>
       <w:cols w:space="720"/>
@@ -10796,6 +10443,18 @@
       <w:ind w:left="220"/>
     </w:pPr>
   </w:style>
+  <w:style w:type="character" w:styleId="MenoPendente">
+    <w:name w:val="Unresolved Mention"/>
+    <w:basedOn w:val="Fontepargpadro"/>
+    <w:uiPriority w:val="99"/>
+    <w:semiHidden/>
+    <w:unhideWhenUsed/>
+    <w:rsid w:val="00A944B9"/>
+    <w:rPr>
+      <w:color w:val="605E5C"/>
+      <w:shd w:val="clear" w:color="auto" w:fill="E1DFDD"/>
+    </w:rPr>
+  </w:style>
 </w:styles>
 </file>
 

</xml_diff>